<commit_message>
Move Syruss to first project in CV
Co-Authored-By: Claude Sonnet 5.5 <noreply@anthropic.com>
Claude-Session: https://claude.ai/code/session_016H4krLd2bXjrWzB2S3CzD9
</commit_message>
<xml_diff>
--- a/Sadeesha_CV_Option3_Banner_fixed.docx
+++ b/Sadeesha_CV_Option3_Banner_fixed.docx
@@ -584,6 +584,86 @@
           <w:sz w:val="22"/>
           <w:szCs w:val="22"/>
         </w:rPr>
+        <w:t>Syruss, Agentic Document Extraction Middleware</w:t>
+      </w:r>
+      <w:r>
+        <w:rPr>
+          <w:color w:val="999999"/>
+          <w:sz w:val="20"/>
+          <w:szCs w:val="20"/>
+        </w:rPr>
+        <w:t xml:space="preserve">  |  </w:t>
+      </w:r>
+      <w:r>
+        <w:rPr>
+          <w:i/>
+          <w:iCs/>
+          <w:color w:val="5A5A5A"/>
+          <w:sz w:val="20"/>
+          <w:szCs w:val="20"/>
+        </w:rPr>
+        <w:t>Python, FastAPI, LangChain, Kafka, PostgreSQL, Next.js</w:t>
+      </w:r>
+      <w:r>
+        <w:rPr>
+          <w:color w:val="999999"/>
+          <w:sz w:val="20"/>
+          <w:szCs w:val="20"/>
+        </w:rPr>
+        <w:t xml:space="preserve">  |  </w:t>
+      </w:r>
+      <w:hyperlink r:id="rId15" w:history="1">
+        <w:r>
+          <w:rPr>
+            <w:color w:val="0F766E"/>
+            <w:sz w:val="20"/>
+            <w:szCs w:val="20"/>
+            <w:u w:val="single"/>
+          </w:rPr>
+          <w:t>GitHub</w:t>
+        </w:r>
+      </w:hyperlink>
+    </w:p>
+    <w:p>
+      <w:pPr>
+        <w:pStyle w:val="ListParagraph"/>
+        <w:numPr>
+          <w:ilvl w:val="0"/>
+          <w:numId w:val="2"/>
+        </w:numPr>
+        <w:spacing w:after="40" w:line="250" w:lineRule="auto"/>
+        <w:rPr>
+          <w:sz w:val="20"/>
+          <w:szCs w:val="20"/>
+        </w:rPr>
+      </w:pPr>
+      <w:r>
+        <w:rPr>
+          <w:color w:val="1A1A1A"/>
+          <w:sz w:val="20"/>
+          <w:szCs w:val="20"/>
+        </w:rPr>
+        <w:t>Built an agentic middleware that turns uploaded documents into validated records, using an autonomous per-workspace agent on an event driven FastAPI, Kafka, and PostgreSQL backend with Keycloak auth and RBAC.</w:t>
+      </w:r>
+    </w:p>
+    <w:p>
+      <w:pPr>
+        <w:keepNext/>
+        <w:spacing w:before="60" w:after="15"/>
+        <w:ind w:left="60"/>
+        <w:rPr>
+          <w:sz w:val="20"/>
+          <w:szCs w:val="20"/>
+        </w:rPr>
+      </w:pPr>
+      <w:r>
+        <w:rPr>
+          <w:b/>
+          <w:bCs/>
+          <w:color w:val="1A1A1A"/>
+          <w:sz w:val="22"/>
+          <w:szCs w:val="22"/>
+        </w:rPr>
         <w:t>MediCare, Healthcare Platform</w:t>
       </w:r>
       <w:r>
@@ -768,86 +848,6 @@
           <w:szCs w:val="20"/>
         </w:rPr>
         <w:t>Designed a React based workflow editor consuming the REST API, and wrote unit, integration, and functional tests covering the plugin loading and event processing core.</w:t>
-      </w:r>
-    </w:p>
-    <w:p>
-      <w:pPr>
-        <w:keepNext/>
-        <w:spacing w:before="60" w:after="15"/>
-        <w:ind w:left="60"/>
-        <w:rPr>
-          <w:sz w:val="20"/>
-          <w:szCs w:val="20"/>
-        </w:rPr>
-      </w:pPr>
-      <w:r>
-        <w:rPr>
-          <w:b/>
-          <w:bCs/>
-          <w:color w:val="1A1A1A"/>
-          <w:sz w:val="22"/>
-          <w:szCs w:val="22"/>
-        </w:rPr>
-        <w:t>Syruss, Agentic Document Extraction Middleware</w:t>
-      </w:r>
-      <w:r>
-        <w:rPr>
-          <w:color w:val="999999"/>
-          <w:sz w:val="20"/>
-          <w:szCs w:val="20"/>
-        </w:rPr>
-        <w:t xml:space="preserve">  |  </w:t>
-      </w:r>
-      <w:r>
-        <w:rPr>
-          <w:i/>
-          <w:iCs/>
-          <w:color w:val="5A5A5A"/>
-          <w:sz w:val="20"/>
-          <w:szCs w:val="20"/>
-        </w:rPr>
-        <w:t>Python, FastAPI, LangChain, Kafka, PostgreSQL, Next.js</w:t>
-      </w:r>
-      <w:r>
-        <w:rPr>
-          <w:color w:val="999999"/>
-          <w:sz w:val="20"/>
-          <w:szCs w:val="20"/>
-        </w:rPr>
-        <w:t xml:space="preserve">  |  </w:t>
-      </w:r>
-      <w:hyperlink r:id="rId15" w:history="1">
-        <w:r>
-          <w:rPr>
-            <w:color w:val="0F766E"/>
-            <w:sz w:val="20"/>
-            <w:szCs w:val="20"/>
-            <w:u w:val="single"/>
-          </w:rPr>
-          <w:t>GitHub</w:t>
-        </w:r>
-      </w:hyperlink>
-    </w:p>
-    <w:p>
-      <w:pPr>
-        <w:pStyle w:val="ListParagraph"/>
-        <w:numPr>
-          <w:ilvl w:val="0"/>
-          <w:numId w:val="2"/>
-        </w:numPr>
-        <w:spacing w:after="40" w:line="250" w:lineRule="auto"/>
-        <w:rPr>
-          <w:sz w:val="20"/>
-          <w:szCs w:val="20"/>
-        </w:rPr>
-      </w:pPr>
-      <w:r>
-        <w:rPr>
-          <w:color w:val="1A1A1A"/>
-          <w:sz w:val="20"/>
-          <w:szCs w:val="20"/>
-        </w:rPr>
-        <w:t>Built an agentic middleware that turns uploaded documents into validated records, using an autonomous per-workspace agent on an event driven FastAPI, Kafka, and PostgreSQL backend with Keycloak auth and RBAC.</w:t>
       </w:r>
     </w:p>
     <w:p>

</xml_diff>